<commit_message>
docs: ajout du rapport technique et de la feuille de route des evolutions (Markdown et Word DOCX)
</commit_message>
<xml_diff>
--- a/Rapport_Processus_Evaluation_Kanaga.docx
+++ b/Rapport_Processus_Evaluation_Kanaga.docx
@@ -1466,7 +1466,7 @@
                 <w:color w:val="1E7E34"/>
                 <w:sz w:val="19"/>
               </w:rPr>
-              <w:t>5 - PE</w:t>
+              <w:t>5 - EXCEPTI</w:t>
             </w:r>
           </w:p>
         </w:tc>
@@ -1536,7 +1536,7 @@
                 <w:color w:val="0C63E4"/>
                 <w:sz w:val="19"/>
               </w:rPr>
-              <w:t>4 - PS</w:t>
+              <w:t>4 - SUPERIE</w:t>
             </w:r>
           </w:p>
         </w:tc>
@@ -1606,7 +1606,7 @@
                 <w:color w:val="0F5132"/>
                 <w:sz w:val="19"/>
               </w:rPr>
-              <w:t>3 - CA</w:t>
+              <w:t>3 - CONFORM</w:t>
             </w:r>
           </w:p>
         </w:tc>
@@ -1676,7 +1676,7 @@
                 <w:color w:val="856404"/>
                 <w:sz w:val="19"/>
               </w:rPr>
-              <w:t>2 - PA</w:t>
+              <w:t>2 - AMELIOR</w:t>
             </w:r>
           </w:p>
         </w:tc>
@@ -1746,7 +1746,7 @@
                 <w:color w:val="842029"/>
                 <w:sz w:val="19"/>
               </w:rPr>
-              <w:t>1 - PI</w:t>
+              <w:t>1 - INSATIS</w:t>
             </w:r>
           </w:p>
         </w:tc>
@@ -1816,7 +1816,7 @@
                 <w:color w:val="555555"/>
                 <w:sz w:val="19"/>
               </w:rPr>
-              <w:t>N/A</w:t>
+              <w:t>NONAPPL</w:t>
             </w:r>
           </w:p>
         </w:tc>
@@ -1839,7 +1839,7 @@
                 <w:color w:val="2D1A0A"/>
                 <w:sz w:val="19"/>
               </w:rPr>
-              <w:t>Non Applicable</w:t>
+              <w:t>N/A Non Applicable</w:t>
             </w:r>
           </w:p>
         </w:tc>
@@ -2025,6 +2025,682 @@
           <w:sz w:val="21"/>
         </w:rPr>
         <w:t>Toutes les actions stratégiques (initiation, soumission, brouillons, clôture) sont tracées en temps réel par la fonction logEvent(). Chaque action est horodatée avec l'identifiant de l'utilisateur, l'action réalisée et son statut, puis enregistrée dans Google Cloud Logging et dans l'onglet 'Logs' du tableur.</w:t>
+      </w:r>
+    </w:p>
+    <w:p>
+      <w:pPr>
+        <w:keepNext/>
+        <w:spacing w:before="360" w:after="120"/>
+      </w:pPr>
+      <w:r>
+        <w:rPr>
+          <w:rFonts w:ascii="Arial" w:hAnsi="Arial"/>
+          <w:b/>
+          <w:color w:val="7C4C26"/>
+          <w:sz w:val="30"/>
+        </w:rPr>
+        <w:t>7. Feuille de Route &amp; Axes d'Amélioration Technique</w:t>
+      </w:r>
+    </w:p>
+    <w:p>
+      <w:pPr>
+        <w:spacing w:after="80" w:line="276" w:lineRule="auto"/>
+      </w:pPr>
+      <w:r>
+        <w:rPr>
+          <w:rFonts w:ascii="Arial" w:hAnsi="Arial"/>
+          <w:i w:val="0"/>
+          <w:color w:val="2D1A0A"/>
+          <w:sz w:val="21"/>
+        </w:rPr>
+        <w:t>Pour garantir la pérennité, la rapidité et la robustesse de l'outil lors des futures montées en charge, six chantiers majeurs sont identifiés :</w:t>
+      </w:r>
+    </w:p>
+    <w:tbl>
+      <w:tblPr>
+        <w:tblW w:type="auto" w:w="0"/>
+        <w:jc w:val="center"/>
+        <w:tblLook w:firstColumn="1" w:firstRow="1" w:lastColumn="0" w:lastRow="0" w:noHBand="0" w:noVBand="1" w:val="04A0"/>
+      </w:tblPr>
+      <w:tblGrid>
+        <w:gridCol w:w="3312"/>
+        <w:gridCol w:w="3312"/>
+        <w:gridCol w:w="3312"/>
+      </w:tblGrid>
+      <w:tr>
+        <w:tc>
+          <w:tcPr>
+            <w:tcW w:type="dxa" w:w="2592"/>
+            <w:shd w:fill="7C4C26"/>
+            <w:tcMar>
+              <w:top w:w="120" w:type="dxa"/>
+              <w:bottom w:w="120" w:type="dxa"/>
+              <w:left w:w="160" w:type="dxa"/>
+              <w:right w:w="160" w:type="dxa"/>
+            </w:tcMar>
+          </w:tcPr>
+          <w:p>
+            <w:r>
+              <w:rPr>
+                <w:rFonts w:ascii="Arial" w:hAnsi="Arial"/>
+                <w:b/>
+                <w:color w:val="FFFFFF"/>
+                <w:sz w:val="20"/>
+              </w:rPr>
+              <w:t>Chantier</w:t>
+            </w:r>
+          </w:p>
+        </w:tc>
+        <w:tc>
+          <w:tcPr>
+            <w:tcW w:type="dxa" w:w="5616"/>
+            <w:shd w:fill="7C4C26"/>
+            <w:tcMar>
+              <w:top w:w="120" w:type="dxa"/>
+              <w:bottom w:w="120" w:type="dxa"/>
+              <w:left w:w="160" w:type="dxa"/>
+              <w:right w:w="160" w:type="dxa"/>
+            </w:tcMar>
+          </w:tcPr>
+          <w:p>
+            <w:r>
+              <w:rPr>
+                <w:rFonts w:ascii="Arial" w:hAnsi="Arial"/>
+                <w:b/>
+                <w:color w:val="FFFFFF"/>
+                <w:sz w:val="20"/>
+              </w:rPr>
+              <w:t>Objectif &amp; Action Recommandée</w:t>
+            </w:r>
+          </w:p>
+        </w:tc>
+        <w:tc>
+          <w:tcPr>
+            <w:tcW w:type="dxa" w:w="1872"/>
+            <w:shd w:fill="7C4C26"/>
+            <w:tcMar>
+              <w:top w:w="120" w:type="dxa"/>
+              <w:bottom w:w="120" w:type="dxa"/>
+              <w:left w:w="160" w:type="dxa"/>
+              <w:right w:w="160" w:type="dxa"/>
+            </w:tcMar>
+          </w:tcPr>
+          <w:p>
+            <w:r>
+              <w:rPr>
+                <w:rFonts w:ascii="Arial" w:hAnsi="Arial"/>
+                <w:b/>
+                <w:color w:val="FFFFFF"/>
+                <w:sz w:val="20"/>
+              </w:rPr>
+              <w:t>Priorité</w:t>
+            </w:r>
+          </w:p>
+        </w:tc>
+      </w:tr>
+      <w:tr>
+        <w:tc>
+          <w:tcPr>
+            <w:tcW w:type="dxa" w:w="2592"/>
+            <w:shd w:fill="FBF9F6"/>
+            <w:tcMar>
+              <w:top w:w="90" w:type="dxa"/>
+              <w:bottom w:w="90" w:type="dxa"/>
+              <w:left w:w="130" w:type="dxa"/>
+              <w:right w:w="130" w:type="dxa"/>
+            </w:tcMar>
+          </w:tcPr>
+          <w:p>
+            <w:r>
+              <w:rPr>
+                <w:rFonts w:ascii="Arial" w:hAnsi="Arial"/>
+                <w:b/>
+                <w:color w:val="7C4C26"/>
+                <w:sz w:val="19"/>
+              </w:rPr>
+              <w:t>1. Modularisation du Code</w:t>
+            </w:r>
+          </w:p>
+        </w:tc>
+        <w:tc>
+          <w:tcPr>
+            <w:tcW w:type="dxa" w:w="5616"/>
+            <w:shd w:fill="FBF9F6"/>
+            <w:tcMar>
+              <w:top w:w="90" w:type="dxa"/>
+              <w:bottom w:w="90" w:type="dxa"/>
+              <w:left w:w="130" w:type="dxa"/>
+              <w:right w:w="130" w:type="dxa"/>
+            </w:tcMar>
+          </w:tcPr>
+          <w:p>
+            <w:r>
+              <w:rPr>
+                <w:rFonts w:ascii="Arial" w:hAnsi="Arial"/>
+                <w:color w:val="2D1A0A"/>
+                <w:sz w:val="19"/>
+              </w:rPr>
+              <w:t>Scinder Code.js (3 900+ lignes) et javascript.html (7 000+ lignes) en services spécialisés (AuthService, EvaluationService, ReminderService, QuestionsService).</w:t>
+            </w:r>
+          </w:p>
+        </w:tc>
+        <w:tc>
+          <w:tcPr>
+            <w:tcW w:type="dxa" w:w="1872"/>
+            <w:shd w:fill="FBF9F6"/>
+            <w:tcMar>
+              <w:top w:w="90" w:type="dxa"/>
+              <w:bottom w:w="90" w:type="dxa"/>
+              <w:left w:w="130" w:type="dxa"/>
+              <w:right w:w="130" w:type="dxa"/>
+            </w:tcMar>
+          </w:tcPr>
+          <w:p>
+            <w:r>
+              <w:rPr>
+                <w:rFonts w:ascii="Arial" w:hAnsi="Arial"/>
+                <w:b/>
+                <w:color w:val="B71C1C"/>
+                <w:sz w:val="19"/>
+              </w:rPr>
+              <w:t>Haute</w:t>
+            </w:r>
+          </w:p>
+        </w:tc>
+      </w:tr>
+      <w:tr>
+        <w:tc>
+          <w:tcPr>
+            <w:tcW w:type="dxa" w:w="2592"/>
+            <w:shd w:fill="FFFFFF"/>
+            <w:tcMar>
+              <w:top w:w="90" w:type="dxa"/>
+              <w:bottom w:w="90" w:type="dxa"/>
+              <w:left w:w="130" w:type="dxa"/>
+              <w:right w:w="130" w:type="dxa"/>
+            </w:tcMar>
+          </w:tcPr>
+          <w:p>
+            <w:r>
+              <w:rPr>
+                <w:rFonts w:ascii="Arial" w:hAnsi="Arial"/>
+                <w:b/>
+                <w:color w:val="7C4C26"/>
+                <w:sz w:val="19"/>
+              </w:rPr>
+              <w:t>2. Cache &amp; Performance</w:t>
+            </w:r>
+          </w:p>
+        </w:tc>
+        <w:tc>
+          <w:tcPr>
+            <w:tcW w:type="dxa" w:w="5616"/>
+            <w:shd w:fill="FFFFFF"/>
+            <w:tcMar>
+              <w:top w:w="90" w:type="dxa"/>
+              <w:bottom w:w="90" w:type="dxa"/>
+              <w:left w:w="130" w:type="dxa"/>
+              <w:right w:w="130" w:type="dxa"/>
+            </w:tcMar>
+          </w:tcPr>
+          <w:p>
+            <w:r>
+              <w:rPr>
+                <w:rFonts w:ascii="Arial" w:hAnsi="Arial"/>
+                <w:color w:val="2D1A0A"/>
+                <w:sz w:val="19"/>
+              </w:rPr>
+              <w:t>Implémenter CacheService pour stocker l'arborescence des questions et profils métiers pendant 30 min. Réduire de 80% les accès répétitifs à Google Sheets.</w:t>
+            </w:r>
+          </w:p>
+        </w:tc>
+        <w:tc>
+          <w:tcPr>
+            <w:tcW w:type="dxa" w:w="1872"/>
+            <w:shd w:fill="FFFFFF"/>
+            <w:tcMar>
+              <w:top w:w="90" w:type="dxa"/>
+              <w:bottom w:w="90" w:type="dxa"/>
+              <w:left w:w="130" w:type="dxa"/>
+              <w:right w:w="130" w:type="dxa"/>
+            </w:tcMar>
+          </w:tcPr>
+          <w:p>
+            <w:r>
+              <w:rPr>
+                <w:rFonts w:ascii="Arial" w:hAnsi="Arial"/>
+                <w:b/>
+                <w:color w:val="B71C1C"/>
+                <w:sz w:val="19"/>
+              </w:rPr>
+              <w:t>Haute</w:t>
+            </w:r>
+          </w:p>
+        </w:tc>
+      </w:tr>
+      <w:tr>
+        <w:tc>
+          <w:tcPr>
+            <w:tcW w:type="dxa" w:w="2592"/>
+            <w:shd w:fill="FBF9F6"/>
+            <w:tcMar>
+              <w:top w:w="90" w:type="dxa"/>
+              <w:bottom w:w="90" w:type="dxa"/>
+              <w:left w:w="130" w:type="dxa"/>
+              <w:right w:w="130" w:type="dxa"/>
+            </w:tcMar>
+          </w:tcPr>
+          <w:p>
+            <w:r>
+              <w:rPr>
+                <w:rFonts w:ascii="Arial" w:hAnsi="Arial"/>
+                <w:b/>
+                <w:color w:val="7C4C26"/>
+                <w:sz w:val="19"/>
+              </w:rPr>
+              <w:t>3. Concurrence &amp; Verrous</w:t>
+            </w:r>
+          </w:p>
+        </w:tc>
+        <w:tc>
+          <w:tcPr>
+            <w:tcW w:type="dxa" w:w="5616"/>
+            <w:shd w:fill="FBF9F6"/>
+            <w:tcMar>
+              <w:top w:w="90" w:type="dxa"/>
+              <w:bottom w:w="90" w:type="dxa"/>
+              <w:left w:w="130" w:type="dxa"/>
+              <w:right w:w="130" w:type="dxa"/>
+            </w:tcMar>
+          </w:tcPr>
+          <w:p>
+            <w:r>
+              <w:rPr>
+                <w:rFonts w:ascii="Arial" w:hAnsi="Arial"/>
+                <w:color w:val="2D1A0A"/>
+                <w:sz w:val="19"/>
+              </w:rPr>
+              <w:t>Encapsuler les sauvegardes et clôtures critiques dans LockService.getScriptLock() afin d'éliminer les risques de collision d'écriture simultanée.</w:t>
+            </w:r>
+          </w:p>
+        </w:tc>
+        <w:tc>
+          <w:tcPr>
+            <w:tcW w:type="dxa" w:w="1872"/>
+            <w:shd w:fill="FBF9F6"/>
+            <w:tcMar>
+              <w:top w:w="90" w:type="dxa"/>
+              <w:bottom w:w="90" w:type="dxa"/>
+              <w:left w:w="130" w:type="dxa"/>
+              <w:right w:w="130" w:type="dxa"/>
+            </w:tcMar>
+          </w:tcPr>
+          <w:p>
+            <w:r>
+              <w:rPr>
+                <w:rFonts w:ascii="Arial" w:hAnsi="Arial"/>
+                <w:b/>
+                <w:color w:val="B71C1C"/>
+                <w:sz w:val="19"/>
+              </w:rPr>
+              <w:t>Haute</w:t>
+            </w:r>
+          </w:p>
+        </w:tc>
+      </w:tr>
+      <w:tr>
+        <w:tc>
+          <w:tcPr>
+            <w:tcW w:type="dxa" w:w="2592"/>
+            <w:shd w:fill="FFFFFF"/>
+            <w:tcMar>
+              <w:top w:w="90" w:type="dxa"/>
+              <w:bottom w:w="90" w:type="dxa"/>
+              <w:left w:w="130" w:type="dxa"/>
+              <w:right w:w="130" w:type="dxa"/>
+            </w:tcMar>
+          </w:tcPr>
+          <w:p>
+            <w:r>
+              <w:rPr>
+                <w:rFonts w:ascii="Arial" w:hAnsi="Arial"/>
+                <w:b/>
+                <w:color w:val="7C4C26"/>
+                <w:sz w:val="19"/>
+              </w:rPr>
+              <w:t>4. Sécurité &amp; Contrôle d'Accès</w:t>
+            </w:r>
+          </w:p>
+        </w:tc>
+        <w:tc>
+          <w:tcPr>
+            <w:tcW w:type="dxa" w:w="5616"/>
+            <w:shd w:fill="FFFFFF"/>
+            <w:tcMar>
+              <w:top w:w="90" w:type="dxa"/>
+              <w:bottom w:w="90" w:type="dxa"/>
+              <w:left w:w="130" w:type="dxa"/>
+              <w:right w:w="130" w:type="dxa"/>
+            </w:tcMar>
+          </w:tcPr>
+          <w:p>
+            <w:r>
+              <w:rPr>
+                <w:rFonts w:ascii="Arial" w:hAnsi="Arial"/>
+                <w:color w:val="2D1A0A"/>
+                <w:sz w:val="19"/>
+              </w:rPr>
+              <w:t>Systématiser la vérification des permissions par évaluation (prévention IDOR) et basculer les identifiants sensibles vers PropertiesService.</w:t>
+            </w:r>
+          </w:p>
+        </w:tc>
+        <w:tc>
+          <w:tcPr>
+            <w:tcW w:type="dxa" w:w="1872"/>
+            <w:shd w:fill="FFFFFF"/>
+            <w:tcMar>
+              <w:top w:w="90" w:type="dxa"/>
+              <w:bottom w:w="90" w:type="dxa"/>
+              <w:left w:w="130" w:type="dxa"/>
+              <w:right w:w="130" w:type="dxa"/>
+            </w:tcMar>
+          </w:tcPr>
+          <w:p>
+            <w:r>
+              <w:rPr>
+                <w:rFonts w:ascii="Arial" w:hAnsi="Arial"/>
+                <w:b/>
+                <w:color w:val="E65100"/>
+                <w:sz w:val="19"/>
+              </w:rPr>
+              <w:t>Moyenne</w:t>
+            </w:r>
+          </w:p>
+        </w:tc>
+      </w:tr>
+      <w:tr>
+        <w:tc>
+          <w:tcPr>
+            <w:tcW w:type="dxa" w:w="2592"/>
+            <w:shd w:fill="FBF9F6"/>
+            <w:tcMar>
+              <w:top w:w="90" w:type="dxa"/>
+              <w:bottom w:w="90" w:type="dxa"/>
+              <w:left w:w="130" w:type="dxa"/>
+              <w:right w:w="130" w:type="dxa"/>
+            </w:tcMar>
+          </w:tcPr>
+          <w:p>
+            <w:r>
+              <w:rPr>
+                <w:rFonts w:ascii="Arial" w:hAnsi="Arial"/>
+                <w:b/>
+                <w:color w:val="7C4C26"/>
+                <w:sz w:val="19"/>
+              </w:rPr>
+              <w:t>5. Résilience Offline (UX)</w:t>
+            </w:r>
+          </w:p>
+        </w:tc>
+        <w:tc>
+          <w:tcPr>
+            <w:tcW w:type="dxa" w:w="5616"/>
+            <w:shd w:fill="FBF9F6"/>
+            <w:tcMar>
+              <w:top w:w="90" w:type="dxa"/>
+              <w:bottom w:w="90" w:type="dxa"/>
+              <w:left w:w="130" w:type="dxa"/>
+              <w:right w:w="130" w:type="dxa"/>
+            </w:tcMar>
+          </w:tcPr>
+          <w:p>
+            <w:r>
+              <w:rPr>
+                <w:rFonts w:ascii="Arial" w:hAnsi="Arial"/>
+                <w:color w:val="2D1A0A"/>
+                <w:sz w:val="19"/>
+              </w:rPr>
+              <w:t>Intégrer une double persistance des réponses sur localStorage / IndexedDB pour éviter toute perte de saisie en cas de micro-coupure réseau.</w:t>
+            </w:r>
+          </w:p>
+        </w:tc>
+        <w:tc>
+          <w:tcPr>
+            <w:tcW w:type="dxa" w:w="1872"/>
+            <w:shd w:fill="FBF9F6"/>
+            <w:tcMar>
+              <w:top w:w="90" w:type="dxa"/>
+              <w:bottom w:w="90" w:type="dxa"/>
+              <w:left w:w="130" w:type="dxa"/>
+              <w:right w:w="130" w:type="dxa"/>
+            </w:tcMar>
+          </w:tcPr>
+          <w:p>
+            <w:r>
+              <w:rPr>
+                <w:rFonts w:ascii="Arial" w:hAnsi="Arial"/>
+                <w:b/>
+                <w:color w:val="E65100"/>
+                <w:sz w:val="19"/>
+              </w:rPr>
+              <w:t>Moyenne</w:t>
+            </w:r>
+          </w:p>
+        </w:tc>
+      </w:tr>
+      <w:tr>
+        <w:tc>
+          <w:tcPr>
+            <w:tcW w:type="dxa" w:w="2592"/>
+            <w:shd w:fill="FFFFFF"/>
+            <w:tcMar>
+              <w:top w:w="90" w:type="dxa"/>
+              <w:bottom w:w="90" w:type="dxa"/>
+              <w:left w:w="130" w:type="dxa"/>
+              <w:right w:w="130" w:type="dxa"/>
+            </w:tcMar>
+          </w:tcPr>
+          <w:p>
+            <w:r>
+              <w:rPr>
+                <w:rFonts w:ascii="Arial" w:hAnsi="Arial"/>
+                <w:b/>
+                <w:color w:val="7C4C26"/>
+                <w:sz w:val="19"/>
+              </w:rPr>
+              <w:t>6. Automatisation CI/CD</w:t>
+            </w:r>
+          </w:p>
+        </w:tc>
+        <w:tc>
+          <w:tcPr>
+            <w:tcW w:type="dxa" w:w="5616"/>
+            <w:shd w:fill="FFFFFF"/>
+            <w:tcMar>
+              <w:top w:w="90" w:type="dxa"/>
+              <w:bottom w:w="90" w:type="dxa"/>
+              <w:left w:w="130" w:type="dxa"/>
+              <w:right w:w="130" w:type="dxa"/>
+            </w:tcMar>
+          </w:tcPr>
+          <w:p>
+            <w:r>
+              <w:rPr>
+                <w:rFonts w:ascii="Arial" w:hAnsi="Arial"/>
+                <w:color w:val="2D1A0A"/>
+                <w:sz w:val="19"/>
+              </w:rPr>
+              <w:t>Mettre en place un workflow GitHub Actions pour exécuter les tests et déployer automatiquement sur la branche main avec clasp.</w:t>
+            </w:r>
+          </w:p>
+        </w:tc>
+        <w:tc>
+          <w:tcPr>
+            <w:tcW w:type="dxa" w:w="1872"/>
+            <w:shd w:fill="FFFFFF"/>
+            <w:tcMar>
+              <w:top w:w="90" w:type="dxa"/>
+              <w:bottom w:w="90" w:type="dxa"/>
+              <w:left w:w="130" w:type="dxa"/>
+              <w:right w:w="130" w:type="dxa"/>
+            </w:tcMar>
+          </w:tcPr>
+          <w:p>
+            <w:r>
+              <w:rPr>
+                <w:rFonts w:ascii="Arial" w:hAnsi="Arial"/>
+                <w:b/>
+                <w:color w:val="2E7D32"/>
+                <w:sz w:val="19"/>
+              </w:rPr>
+              <w:t>Évolution</w:t>
+            </w:r>
+          </w:p>
+        </w:tc>
+      </w:tr>
+    </w:tbl>
+    <w:p>
+      <w:pPr>
+        <w:keepNext/>
+        <w:spacing w:before="360" w:after="120"/>
+      </w:pPr>
+      <w:r>
+        <w:rPr>
+          <w:rFonts w:ascii="Arial" w:hAnsi="Arial"/>
+          <w:b/>
+          <w:color w:val="7C4C26"/>
+          <w:sz w:val="30"/>
+        </w:rPr>
+        <w:t>8. Protocole Opérationnel des Futures Mises à Jour</w:t>
+      </w:r>
+    </w:p>
+    <w:p>
+      <w:pPr>
+        <w:spacing w:after="80" w:line="276" w:lineRule="auto"/>
+      </w:pPr>
+      <w:r>
+        <w:rPr>
+          <w:rFonts w:ascii="Arial" w:hAnsi="Arial"/>
+          <w:i w:val="0"/>
+          <w:color w:val="2D1A0A"/>
+          <w:sz w:val="21"/>
+        </w:rPr>
+        <w:t>Pour toute mise à jour ultérieure, l'équipe technique doit suivre la procédure standard suivante :</w:t>
+      </w:r>
+    </w:p>
+    <w:p>
+      <w:pPr>
+        <w:pStyle w:val="ListBullet"/>
+        <w:spacing w:after="60" w:line="276" w:lineRule="auto"/>
+      </w:pPr>
+      <w:r>
+        <w:rPr>
+          <w:rFonts w:ascii="Arial" w:hAnsi="Arial"/>
+          <w:b/>
+          <w:color w:val="2D1A0A"/>
+          <w:sz w:val="21"/>
+        </w:rPr>
+        <w:t xml:space="preserve">1. Récupération : </w:t>
+      </w:r>
+      <w:r>
+        <w:rPr>
+          <w:rFonts w:ascii="Arial" w:hAnsi="Arial"/>
+          <w:color w:val="2D1A0A"/>
+          <w:sz w:val="21"/>
+        </w:rPr>
+        <w:t>git pull origin main et npx clasp pull pour synchroniser le code.</w:t>
+      </w:r>
+    </w:p>
+    <w:p>
+      <w:pPr>
+        <w:pStyle w:val="ListBullet"/>
+        <w:spacing w:after="60" w:line="276" w:lineRule="auto"/>
+      </w:pPr>
+      <w:r>
+        <w:rPr>
+          <w:rFonts w:ascii="Arial" w:hAnsi="Arial"/>
+          <w:b/>
+          <w:color w:val="2D1A0A"/>
+          <w:sz w:val="21"/>
+        </w:rPr>
+        <w:t xml:space="preserve">2. Développement : </w:t>
+      </w:r>
+      <w:r>
+        <w:rPr>
+          <w:rFonts w:ascii="Arial" w:hAnsi="Arial"/>
+          <w:color w:val="2D1A0A"/>
+          <w:sz w:val="21"/>
+        </w:rPr>
+        <w:t>Édition du code dans le respect de la charte visuelle Kanaga et des conventions de nommage.</w:t>
+      </w:r>
+    </w:p>
+    <w:p>
+      <w:pPr>
+        <w:pStyle w:val="ListBullet"/>
+        <w:spacing w:after="60" w:line="276" w:lineRule="auto"/>
+      </w:pPr>
+      <w:r>
+        <w:rPr>
+          <w:rFonts w:ascii="Arial" w:hAnsi="Arial"/>
+          <w:b/>
+          <w:color w:val="2D1A0A"/>
+          <w:sz w:val="21"/>
+        </w:rPr>
+        <w:t xml:space="preserve">3. Sauvegarde Git : </w:t>
+      </w:r>
+      <w:r>
+        <w:rPr>
+          <w:rFonts w:ascii="Arial" w:hAnsi="Arial"/>
+          <w:color w:val="2D1A0A"/>
+          <w:sz w:val="21"/>
+        </w:rPr>
+        <w:t>git add -A puis git commit -m 'feat: ...' et git push origin main.</w:t>
+      </w:r>
+    </w:p>
+    <w:p>
+      <w:pPr>
+        <w:pStyle w:val="ListBullet"/>
+        <w:spacing w:after="60" w:line="276" w:lineRule="auto"/>
+      </w:pPr>
+      <w:r>
+        <w:rPr>
+          <w:rFonts w:ascii="Arial" w:hAnsi="Arial"/>
+          <w:b/>
+          <w:color w:val="2D1A0A"/>
+          <w:sz w:val="21"/>
+        </w:rPr>
+        <w:t xml:space="preserve">4. Déploiement Permanent : </w:t>
+      </w:r>
+      <w:r>
+        <w:rPr>
+          <w:rFonts w:ascii="Arial" w:hAnsi="Arial"/>
+          <w:color w:val="2D1A0A"/>
+          <w:sz w:val="21"/>
+        </w:rPr>
+        <w:t>Exécuter 'node deploy.js' pour pousser le code et mettre à jour le déploiement fixe sans modifier l'URL publique des utilisateurs.</w:t>
+      </w:r>
+    </w:p>
+    <w:p>
+      <w:pPr>
+        <w:pStyle w:val="ListBullet"/>
+        <w:spacing w:after="60" w:line="276" w:lineRule="auto"/>
+      </w:pPr>
+      <w:r>
+        <w:rPr>
+          <w:rFonts w:ascii="Arial" w:hAnsi="Arial"/>
+          <w:b/>
+          <w:color w:val="2D1A0A"/>
+          <w:sz w:val="21"/>
+        </w:rPr>
+        <w:t xml:space="preserve">5. URL Permanente Invariable : </w:t>
+      </w:r>
+      <w:r>
+        <w:rPr>
+          <w:rFonts w:ascii="Arial" w:hAnsi="Arial"/>
+          <w:color w:val="2D1A0A"/>
+          <w:sz w:val="21"/>
+        </w:rPr>
+        <w:t>https://script.google.com/macros/s/AKfycbxeoDfu8Uh9plmQXjud3N1cXUBmSAaIpgdrXQxgWEnp1jst3K3N2puD1pF3zl1XYsRntA/exec</w:t>
       </w:r>
     </w:p>
     <w:sectPr>

</xml_diff>